<commit_message>
Added the solution for the Final Assignment 12.1
</commit_message>
<xml_diff>
--- a/05_Assignment/Documentation/Final Assignment 12.1.docx
+++ b/05_Assignment/Documentation/Final Assignment 12.1.docx
@@ -897,6 +897,83 @@
     <w:p>
       <w:pPr>
         <w:pStyle w:val="ListParagraph"/>
+        <w:rPr>
+          <w:sz w:val="28"/>
+          <w:szCs w:val="28"/>
+        </w:rPr>
+      </w:pPr>
+    </w:p>
+    <w:p>
+      <w:pPr>
+        <w:pStyle w:val="ListParagraph"/>
+        <w:rPr>
+          <w:sz w:val="28"/>
+          <w:szCs w:val="28"/>
+        </w:rPr>
+      </w:pPr>
+      <w:r>
+        <w:rPr>
+          <w:sz w:val="28"/>
+          <w:szCs w:val="28"/>
+        </w:rPr>
+        <w:drawing>
+          <wp:inline distT="0" distB="0" distL="0" distR="0" wp14:anchorId="67C23283" wp14:editId="70870E32">
+            <wp:extent cx="5943600" cy="2440305"/>
+            <wp:effectExtent l="0" t="0" r="0" b="0"/>
+            <wp:docPr id="1987111035" name="Picture 1"/>
+            <wp:cNvGraphicFramePr>
+              <a:graphicFrameLocks xmlns:a="http://schemas.openxmlformats.org/drawingml/2006/main" noChangeAspect="1"/>
+            </wp:cNvGraphicFramePr>
+            <a:graphic xmlns:a="http://schemas.openxmlformats.org/drawingml/2006/main">
+              <a:graphicData uri="http://schemas.openxmlformats.org/drawingml/2006/picture">
+                <pic:pic xmlns:pic="http://schemas.openxmlformats.org/drawingml/2006/picture">
+                  <pic:nvPicPr>
+                    <pic:cNvPr id="1987111035" name=""/>
+                    <pic:cNvPicPr/>
+                  </pic:nvPicPr>
+                  <pic:blipFill>
+                    <a:blip r:embed="rId15"/>
+                    <a:stretch>
+                      <a:fillRect/>
+                    </a:stretch>
+                  </pic:blipFill>
+                  <pic:spPr>
+                    <a:xfrm>
+                      <a:off x="0" y="0"/>
+                      <a:ext cx="5943600" cy="2440305"/>
+                    </a:xfrm>
+                    <a:prstGeom prst="rect">
+                      <a:avLst/>
+                    </a:prstGeom>
+                  </pic:spPr>
+                </pic:pic>
+              </a:graphicData>
+            </a:graphic>
+          </wp:inline>
+        </w:drawing>
+      </w:r>
+    </w:p>
+    <w:p>
+      <w:pPr>
+        <w:pStyle w:val="ListParagraph"/>
+        <w:rPr>
+          <w:sz w:val="28"/>
+          <w:szCs w:val="28"/>
+        </w:rPr>
+      </w:pPr>
+    </w:p>
+    <w:p>
+      <w:pPr>
+        <w:pStyle w:val="ListParagraph"/>
+        <w:rPr>
+          <w:sz w:val="28"/>
+          <w:szCs w:val="28"/>
+        </w:rPr>
+      </w:pPr>
+    </w:p>
+    <w:p>
+      <w:pPr>
+        <w:pStyle w:val="ListParagraph"/>
         <w:numPr>
           <w:ilvl w:val="0"/>
           <w:numId w:val="5"/>
@@ -911,8 +988,198 @@
           <w:sz w:val="28"/>
           <w:szCs w:val="28"/>
         </w:rPr>
+        <w:lastRenderedPageBreak/>
         <w:t>Provide two screenshots: The first screenshot should show that you successfully ran the command to create the “final_assignment_part3” container in your Terminal window. The second screenshot should show that the container you created is active on Docker.</w:t>
       </w:r>
+    </w:p>
+    <w:p>
+      <w:pPr>
+        <w:spacing w:after="0" w:line="300" w:lineRule="atLeast"/>
+        <w:ind w:left="360" w:firstLine="360"/>
+        <w:rPr>
+          <w:rFonts w:ascii="Segoe UI" w:eastAsia="Times New Roman" w:hAnsi="Segoe UI" w:cs="Segoe UI"/>
+          <w:kern w:val="0"/>
+          <w:sz w:val="21"/>
+          <w:szCs w:val="21"/>
+          <w14:ligatures w14:val="none"/>
+        </w:rPr>
+      </w:pPr>
+      <w:r>
+        <w:rPr>
+          <w:rFonts w:ascii="Segoe UI" w:eastAsia="Times New Roman" w:hAnsi="Segoe UI" w:cs="Segoe UI"/>
+          <w:kern w:val="0"/>
+          <w:sz w:val="21"/>
+          <w:szCs w:val="21"/>
+          <w14:ligatures w14:val="none"/>
+        </w:rPr>
+        <w:t>Create the Redis Container</w:t>
+      </w:r>
+      <w:r>
+        <w:rPr>
+          <w:rFonts w:ascii="Segoe UI" w:eastAsia="Times New Roman" w:hAnsi="Segoe UI" w:cs="Segoe UI"/>
+          <w:kern w:val="0"/>
+          <w:sz w:val="21"/>
+          <w:szCs w:val="21"/>
+          <w14:ligatures w14:val="none"/>
+        </w:rPr>
+        <w:t>:</w:t>
+      </w:r>
+    </w:p>
+    <w:p>
+      <w:pPr>
+        <w:pStyle w:val="ListParagraph"/>
+        <w:rPr>
+          <w:sz w:val="28"/>
+          <w:szCs w:val="28"/>
+        </w:rPr>
+      </w:pPr>
+    </w:p>
+    <w:p>
+      <w:pPr>
+        <w:pStyle w:val="ListParagraph"/>
+        <w:rPr>
+          <w:sz w:val="28"/>
+          <w:szCs w:val="28"/>
+        </w:rPr>
+      </w:pPr>
+      <w:r>
+        <w:rPr>
+          <w:sz w:val="28"/>
+          <w:szCs w:val="28"/>
+        </w:rPr>
+        <w:drawing>
+          <wp:inline distT="0" distB="0" distL="0" distR="0" wp14:anchorId="1617E801" wp14:editId="77CABBE4">
+            <wp:extent cx="6157872" cy="1478942"/>
+            <wp:effectExtent l="0" t="0" r="0" b="6985"/>
+            <wp:docPr id="1022930024" name="Picture 1"/>
+            <wp:cNvGraphicFramePr>
+              <a:graphicFrameLocks xmlns:a="http://schemas.openxmlformats.org/drawingml/2006/main" noChangeAspect="1"/>
+            </wp:cNvGraphicFramePr>
+            <a:graphic xmlns:a="http://schemas.openxmlformats.org/drawingml/2006/main">
+              <a:graphicData uri="http://schemas.openxmlformats.org/drawingml/2006/picture">
+                <pic:pic xmlns:pic="http://schemas.openxmlformats.org/drawingml/2006/picture">
+                  <pic:nvPicPr>
+                    <pic:cNvPr id="1022930024" name=""/>
+                    <pic:cNvPicPr/>
+                  </pic:nvPicPr>
+                  <pic:blipFill>
+                    <a:blip r:embed="rId16"/>
+                    <a:stretch>
+                      <a:fillRect/>
+                    </a:stretch>
+                  </pic:blipFill>
+                  <pic:spPr>
+                    <a:xfrm>
+                      <a:off x="0" y="0"/>
+                      <a:ext cx="6168910" cy="1481593"/>
+                    </a:xfrm>
+                    <a:prstGeom prst="rect">
+                      <a:avLst/>
+                    </a:prstGeom>
+                  </pic:spPr>
+                </pic:pic>
+              </a:graphicData>
+            </a:graphic>
+          </wp:inline>
+        </w:drawing>
+      </w:r>
+    </w:p>
+    <w:p>
+      <w:pPr>
+        <w:pStyle w:val="ListParagraph"/>
+        <w:rPr>
+          <w:sz w:val="28"/>
+          <w:szCs w:val="28"/>
+        </w:rPr>
+      </w:pPr>
+    </w:p>
+    <w:p>
+      <w:pPr>
+        <w:pStyle w:val="ListParagraph"/>
+        <w:rPr>
+          <w:noProof/>
+        </w:rPr>
+      </w:pPr>
+      <w:r>
+        <w:rPr>
+          <w:sz w:val="28"/>
+          <w:szCs w:val="28"/>
+        </w:rPr>
+        <w:t>Redis Container on Docker Desktop:</w:t>
+      </w:r>
+      <w:r>
+        <w:rPr>
+          <w:noProof/>
+        </w:rPr>
+        <w:t xml:space="preserve"> </w:t>
+      </w:r>
+    </w:p>
+    <w:p>
+      <w:pPr>
+        <w:pStyle w:val="ListParagraph"/>
+        <w:rPr>
+          <w:noProof/>
+        </w:rPr>
+      </w:pPr>
+      <w:r>
+        <w:rPr>
+          <w:sz w:val="28"/>
+          <w:szCs w:val="28"/>
+        </w:rPr>
+        <w:drawing>
+          <wp:inline distT="0" distB="0" distL="0" distR="0" wp14:anchorId="51385674" wp14:editId="2C6873AC">
+            <wp:extent cx="5943600" cy="3159760"/>
+            <wp:effectExtent l="0" t="0" r="0" b="2540"/>
+            <wp:docPr id="462178205" name="Picture 1"/>
+            <wp:cNvGraphicFramePr>
+              <a:graphicFrameLocks xmlns:a="http://schemas.openxmlformats.org/drawingml/2006/main" noChangeAspect="1"/>
+            </wp:cNvGraphicFramePr>
+            <a:graphic xmlns:a="http://schemas.openxmlformats.org/drawingml/2006/main">
+              <a:graphicData uri="http://schemas.openxmlformats.org/drawingml/2006/picture">
+                <pic:pic xmlns:pic="http://schemas.openxmlformats.org/drawingml/2006/picture">
+                  <pic:nvPicPr>
+                    <pic:cNvPr id="462178205" name=""/>
+                    <pic:cNvPicPr/>
+                  </pic:nvPicPr>
+                  <pic:blipFill>
+                    <a:blip r:embed="rId17"/>
+                    <a:stretch>
+                      <a:fillRect/>
+                    </a:stretch>
+                  </pic:blipFill>
+                  <pic:spPr>
+                    <a:xfrm>
+                      <a:off x="0" y="0"/>
+                      <a:ext cx="5943600" cy="3159760"/>
+                    </a:xfrm>
+                    <a:prstGeom prst="rect">
+                      <a:avLst/>
+                    </a:prstGeom>
+                  </pic:spPr>
+                </pic:pic>
+              </a:graphicData>
+            </a:graphic>
+          </wp:inline>
+        </w:drawing>
+      </w:r>
+    </w:p>
+    <w:p>
+      <w:pPr>
+        <w:pStyle w:val="ListParagraph"/>
+        <w:rPr>
+          <w:sz w:val="28"/>
+          <w:szCs w:val="28"/>
+        </w:rPr>
+      </w:pPr>
+    </w:p>
+    <w:p>
+      <w:pPr>
+        <w:pStyle w:val="ListParagraph"/>
+        <w:rPr>
+          <w:sz w:val="28"/>
+          <w:szCs w:val="28"/>
+        </w:rPr>
+      </w:pPr>
     </w:p>
     <w:p>
       <w:pPr>
@@ -953,6 +1220,130 @@
     <w:p>
       <w:pPr>
         <w:pStyle w:val="ListParagraph"/>
+        <w:rPr>
+          <w:sz w:val="28"/>
+          <w:szCs w:val="28"/>
+        </w:rPr>
+      </w:pPr>
+    </w:p>
+    <w:p>
+      <w:pPr>
+        <w:pStyle w:val="ListParagraph"/>
+        <w:rPr>
+          <w:sz w:val="28"/>
+          <w:szCs w:val="28"/>
+        </w:rPr>
+      </w:pPr>
+      <w:r>
+        <w:rPr>
+          <w:sz w:val="28"/>
+          <w:szCs w:val="28"/>
+        </w:rPr>
+        <w:lastRenderedPageBreak/>
+        <w:t xml:space="preserve">Redis write.py file using the </w:t>
+      </w:r>
+      <w:proofErr w:type="spellStart"/>
+      <w:proofErr w:type="gramStart"/>
+      <w:r>
+        <w:rPr>
+          <w:sz w:val="28"/>
+          <w:szCs w:val="28"/>
+        </w:rPr>
+        <w:t>mset</w:t>
+      </w:r>
+      <w:proofErr w:type="spellEnd"/>
+      <w:r>
+        <w:rPr>
+          <w:sz w:val="28"/>
+          <w:szCs w:val="28"/>
+        </w:rPr>
+        <w:t>(</w:t>
+      </w:r>
+      <w:proofErr w:type="gramEnd"/>
+      <w:r>
+        <w:rPr>
+          <w:sz w:val="28"/>
+          <w:szCs w:val="28"/>
+        </w:rPr>
+        <w:t>) method to create key-value pairs:</w:t>
+      </w:r>
+      <w:r>
+        <w:rPr>
+          <w:sz w:val="28"/>
+          <w:szCs w:val="28"/>
+        </w:rPr>
+        <w:t xml:space="preserve"> </w:t>
+      </w:r>
+      <w:r>
+        <w:rPr>
+          <w:sz w:val="28"/>
+          <w:szCs w:val="28"/>
+        </w:rPr>
+        <w:t>Milk → Lactose and Bread → Gluten.</w:t>
+      </w:r>
+    </w:p>
+    <w:p>
+      <w:pPr>
+        <w:pStyle w:val="ListParagraph"/>
+        <w:rPr>
+          <w:sz w:val="28"/>
+          <w:szCs w:val="28"/>
+        </w:rPr>
+      </w:pPr>
+      <w:r>
+        <w:rPr>
+          <w:sz w:val="28"/>
+          <w:szCs w:val="28"/>
+        </w:rPr>
+        <w:drawing>
+          <wp:inline distT="0" distB="0" distL="0" distR="0" wp14:anchorId="04CB69D6" wp14:editId="0D058793">
+            <wp:extent cx="5943600" cy="2141855"/>
+            <wp:effectExtent l="0" t="0" r="0" b="0"/>
+            <wp:docPr id="301800335" name="Picture 1"/>
+            <wp:cNvGraphicFramePr>
+              <a:graphicFrameLocks xmlns:a="http://schemas.openxmlformats.org/drawingml/2006/main" noChangeAspect="1"/>
+            </wp:cNvGraphicFramePr>
+            <a:graphic xmlns:a="http://schemas.openxmlformats.org/drawingml/2006/main">
+              <a:graphicData uri="http://schemas.openxmlformats.org/drawingml/2006/picture">
+                <pic:pic xmlns:pic="http://schemas.openxmlformats.org/drawingml/2006/picture">
+                  <pic:nvPicPr>
+                    <pic:cNvPr id="301800335" name=""/>
+                    <pic:cNvPicPr/>
+                  </pic:nvPicPr>
+                  <pic:blipFill>
+                    <a:blip r:embed="rId18"/>
+                    <a:stretch>
+                      <a:fillRect/>
+                    </a:stretch>
+                  </pic:blipFill>
+                  <pic:spPr>
+                    <a:xfrm>
+                      <a:off x="0" y="0"/>
+                      <a:ext cx="5943600" cy="2141855"/>
+                    </a:xfrm>
+                    <a:prstGeom prst="rect">
+                      <a:avLst/>
+                    </a:prstGeom>
+                  </pic:spPr>
+                </pic:pic>
+              </a:graphicData>
+            </a:graphic>
+          </wp:inline>
+        </w:drawing>
+      </w:r>
+    </w:p>
+    <w:p>
+      <w:pPr>
+        <w:pStyle w:val="ListParagraph"/>
+        <w:rPr>
+          <w:sz w:val="28"/>
+          <w:szCs w:val="28"/>
+        </w:rPr>
+      </w:pPr>
+    </w:p>
+    <w:p>
+      <w:pPr>
+        <w:pStyle w:val="ListParagraph"/>
         <w:numPr>
           <w:ilvl w:val="0"/>
           <w:numId w:val="5"/>
@@ -973,6 +1364,133 @@
     <w:p>
       <w:pPr>
         <w:pStyle w:val="ListParagraph"/>
+        <w:rPr>
+          <w:sz w:val="28"/>
+          <w:szCs w:val="28"/>
+        </w:rPr>
+      </w:pPr>
+    </w:p>
+    <w:p>
+      <w:pPr>
+        <w:pStyle w:val="ListParagraph"/>
+        <w:rPr>
+          <w:sz w:val="28"/>
+          <w:szCs w:val="28"/>
+        </w:rPr>
+      </w:pPr>
+      <w:r>
+        <w:rPr>
+          <w:sz w:val="28"/>
+          <w:szCs w:val="28"/>
+        </w:rPr>
+        <w:t xml:space="preserve">Redis write.py executed successfully, storing the key-value pairs Milk → Lactose and Bread → Gluten using the </w:t>
+      </w:r>
+      <w:proofErr w:type="spellStart"/>
+      <w:proofErr w:type="gramStart"/>
+      <w:r>
+        <w:rPr>
+          <w:sz w:val="28"/>
+          <w:szCs w:val="28"/>
+        </w:rPr>
+        <w:t>mset</w:t>
+      </w:r>
+      <w:proofErr w:type="spellEnd"/>
+      <w:r>
+        <w:rPr>
+          <w:sz w:val="28"/>
+          <w:szCs w:val="28"/>
+        </w:rPr>
+        <w:t>(</w:t>
+      </w:r>
+      <w:proofErr w:type="gramEnd"/>
+      <w:r>
+        <w:rPr>
+          <w:sz w:val="28"/>
+          <w:szCs w:val="28"/>
+        </w:rPr>
+        <w:t>) method.</w:t>
+      </w:r>
+    </w:p>
+    <w:p>
+      <w:pPr>
+        <w:pStyle w:val="ListParagraph"/>
+        <w:rPr>
+          <w:sz w:val="28"/>
+          <w:szCs w:val="28"/>
+        </w:rPr>
+      </w:pPr>
+      <w:r>
+        <w:rPr>
+          <w:sz w:val="28"/>
+          <w:szCs w:val="28"/>
+        </w:rPr>
+        <w:drawing>
+          <wp:inline distT="0" distB="0" distL="0" distR="0" wp14:anchorId="636F0709" wp14:editId="3DD735A2">
+            <wp:extent cx="5943600" cy="3140075"/>
+            <wp:effectExtent l="0" t="0" r="0" b="3175"/>
+            <wp:docPr id="1622503760" name="Picture 1"/>
+            <wp:cNvGraphicFramePr>
+              <a:graphicFrameLocks xmlns:a="http://schemas.openxmlformats.org/drawingml/2006/main" noChangeAspect="1"/>
+            </wp:cNvGraphicFramePr>
+            <a:graphic xmlns:a="http://schemas.openxmlformats.org/drawingml/2006/main">
+              <a:graphicData uri="http://schemas.openxmlformats.org/drawingml/2006/picture">
+                <pic:pic xmlns:pic="http://schemas.openxmlformats.org/drawingml/2006/picture">
+                  <pic:nvPicPr>
+                    <pic:cNvPr id="1622503760" name=""/>
+                    <pic:cNvPicPr/>
+                  </pic:nvPicPr>
+                  <pic:blipFill>
+                    <a:blip r:embed="rId19"/>
+                    <a:stretch>
+                      <a:fillRect/>
+                    </a:stretch>
+                  </pic:blipFill>
+                  <pic:spPr>
+                    <a:xfrm>
+                      <a:off x="0" y="0"/>
+                      <a:ext cx="5943600" cy="3140075"/>
+                    </a:xfrm>
+                    <a:prstGeom prst="rect">
+                      <a:avLst/>
+                    </a:prstGeom>
+                  </pic:spPr>
+                </pic:pic>
+              </a:graphicData>
+            </a:graphic>
+          </wp:inline>
+        </w:drawing>
+      </w:r>
+    </w:p>
+    <w:p>
+      <w:pPr>
+        <w:pStyle w:val="ListParagraph"/>
+        <w:rPr>
+          <w:sz w:val="28"/>
+          <w:szCs w:val="28"/>
+        </w:rPr>
+      </w:pPr>
+    </w:p>
+    <w:p>
+      <w:pPr>
+        <w:pStyle w:val="ListParagraph"/>
+        <w:rPr>
+          <w:sz w:val="28"/>
+          <w:szCs w:val="28"/>
+        </w:rPr>
+      </w:pPr>
+    </w:p>
+    <w:p>
+      <w:pPr>
+        <w:pStyle w:val="ListParagraph"/>
+        <w:rPr>
+          <w:sz w:val="28"/>
+          <w:szCs w:val="28"/>
+        </w:rPr>
+      </w:pPr>
+    </w:p>
+    <w:p>
+      <w:pPr>
+        <w:pStyle w:val="ListParagraph"/>
         <w:numPr>
           <w:ilvl w:val="0"/>
           <w:numId w:val="5"/>
@@ -987,8 +1505,235 @@
           <w:sz w:val="28"/>
           <w:szCs w:val="28"/>
         </w:rPr>
+        <w:lastRenderedPageBreak/>
         <w:t>Provide a screenshot of the read.py file to show your updated code after you used the Redis method, get, to read all values in r.</w:t>
       </w:r>
+    </w:p>
+    <w:p>
+      <w:pPr>
+        <w:pStyle w:val="ListParagraph"/>
+        <w:rPr>
+          <w:sz w:val="28"/>
+          <w:szCs w:val="28"/>
+        </w:rPr>
+      </w:pPr>
+    </w:p>
+    <w:p>
+      <w:pPr>
+        <w:pStyle w:val="ListParagraph"/>
+        <w:rPr>
+          <w:sz w:val="28"/>
+          <w:szCs w:val="28"/>
+        </w:rPr>
+      </w:pPr>
+      <w:r>
+        <w:rPr>
+          <w:sz w:val="28"/>
+          <w:szCs w:val="28"/>
+        </w:rPr>
+        <w:t>Edit the read.py file to show:</w:t>
+      </w:r>
+    </w:p>
+    <w:p>
+      <w:pPr>
+        <w:ind w:left="720"/>
+        <w:rPr>
+          <w:sz w:val="28"/>
+          <w:szCs w:val="28"/>
+        </w:rPr>
+      </w:pPr>
+      <w:r>
+        <w:rPr>
+          <w:sz w:val="28"/>
+          <w:szCs w:val="28"/>
+        </w:rPr>
+        <w:drawing>
+          <wp:inline distT="0" distB="0" distL="0" distR="0" wp14:anchorId="220D4F5C" wp14:editId="43F811C4">
+            <wp:extent cx="5943600" cy="2555240"/>
+            <wp:effectExtent l="0" t="0" r="0" b="0"/>
+            <wp:docPr id="1023349746" name="Picture 1"/>
+            <wp:cNvGraphicFramePr>
+              <a:graphicFrameLocks xmlns:a="http://schemas.openxmlformats.org/drawingml/2006/main" noChangeAspect="1"/>
+            </wp:cNvGraphicFramePr>
+            <a:graphic xmlns:a="http://schemas.openxmlformats.org/drawingml/2006/main">
+              <a:graphicData uri="http://schemas.openxmlformats.org/drawingml/2006/picture">
+                <pic:pic xmlns:pic="http://schemas.openxmlformats.org/drawingml/2006/picture">
+                  <pic:nvPicPr>
+                    <pic:cNvPr id="1023349746" name=""/>
+                    <pic:cNvPicPr/>
+                  </pic:nvPicPr>
+                  <pic:blipFill>
+                    <a:blip r:embed="rId20"/>
+                    <a:stretch>
+                      <a:fillRect/>
+                    </a:stretch>
+                  </pic:blipFill>
+                  <pic:spPr>
+                    <a:xfrm>
+                      <a:off x="0" y="0"/>
+                      <a:ext cx="5943600" cy="2555240"/>
+                    </a:xfrm>
+                    <a:prstGeom prst="rect">
+                      <a:avLst/>
+                    </a:prstGeom>
+                  </pic:spPr>
+                </pic:pic>
+              </a:graphicData>
+            </a:graphic>
+          </wp:inline>
+        </w:drawing>
+      </w:r>
+    </w:p>
+    <w:p>
+      <w:pPr>
+        <w:ind w:left="720"/>
+        <w:rPr>
+          <w:sz w:val="28"/>
+          <w:szCs w:val="28"/>
+        </w:rPr>
+      </w:pPr>
+    </w:p>
+    <w:p>
+      <w:pPr>
+        <w:ind w:left="720"/>
+        <w:rPr>
+          <w:sz w:val="28"/>
+          <w:szCs w:val="28"/>
+        </w:rPr>
+      </w:pPr>
+      <w:r>
+        <w:rPr>
+          <w:sz w:val="28"/>
+          <w:szCs w:val="28"/>
+        </w:rPr>
+        <w:t>Result when running the read.py:</w:t>
+      </w:r>
+    </w:p>
+    <w:p>
+      <w:pPr>
+        <w:ind w:left="720"/>
+        <w:rPr>
+          <w:sz w:val="28"/>
+          <w:szCs w:val="28"/>
+        </w:rPr>
+      </w:pPr>
+      <w:r>
+        <w:rPr>
+          <w:sz w:val="28"/>
+          <w:szCs w:val="28"/>
+        </w:rPr>
+        <w:drawing>
+          <wp:inline distT="0" distB="0" distL="0" distR="0" wp14:anchorId="6746D40D" wp14:editId="1A2B9EAA">
+            <wp:extent cx="5943600" cy="3303270"/>
+            <wp:effectExtent l="0" t="0" r="0" b="0"/>
+            <wp:docPr id="330424694" name="Picture 1"/>
+            <wp:cNvGraphicFramePr>
+              <a:graphicFrameLocks xmlns:a="http://schemas.openxmlformats.org/drawingml/2006/main" noChangeAspect="1"/>
+            </wp:cNvGraphicFramePr>
+            <a:graphic xmlns:a="http://schemas.openxmlformats.org/drawingml/2006/main">
+              <a:graphicData uri="http://schemas.openxmlformats.org/drawingml/2006/picture">
+                <pic:pic xmlns:pic="http://schemas.openxmlformats.org/drawingml/2006/picture">
+                  <pic:nvPicPr>
+                    <pic:cNvPr id="330424694" name=""/>
+                    <pic:cNvPicPr/>
+                  </pic:nvPicPr>
+                  <pic:blipFill>
+                    <a:blip r:embed="rId21"/>
+                    <a:stretch>
+                      <a:fillRect/>
+                    </a:stretch>
+                  </pic:blipFill>
+                  <pic:spPr>
+                    <a:xfrm>
+                      <a:off x="0" y="0"/>
+                      <a:ext cx="5943600" cy="3303270"/>
+                    </a:xfrm>
+                    <a:prstGeom prst="rect">
+                      <a:avLst/>
+                    </a:prstGeom>
+                  </pic:spPr>
+                </pic:pic>
+              </a:graphicData>
+            </a:graphic>
+          </wp:inline>
+        </w:drawing>
+      </w:r>
+    </w:p>
+    <w:p>
+      <w:pPr>
+        <w:ind w:left="720"/>
+        <w:rPr>
+          <w:sz w:val="28"/>
+          <w:szCs w:val="28"/>
+        </w:rPr>
+      </w:pPr>
+      <w:r>
+        <w:rPr>
+          <w:sz w:val="28"/>
+          <w:szCs w:val="28"/>
+        </w:rPr>
+        <w:lastRenderedPageBreak/>
+        <w:t>Part 3(e): Redis key-value pairs successfully written to the Redis database. The Redis extension shows the keys Bread and Milk stored in the containerized Redis instance.</w:t>
+      </w:r>
+    </w:p>
+    <w:p>
+      <w:pPr>
+        <w:pStyle w:val="ListParagraph"/>
+        <w:rPr>
+          <w:sz w:val="28"/>
+          <w:szCs w:val="28"/>
+        </w:rPr>
+      </w:pPr>
+      <w:r>
+        <w:rPr>
+          <w:sz w:val="28"/>
+          <w:szCs w:val="28"/>
+        </w:rPr>
+        <w:drawing>
+          <wp:inline distT="0" distB="0" distL="0" distR="0" wp14:anchorId="78E4CCDE" wp14:editId="7C9447BF">
+            <wp:extent cx="3972479" cy="2743583"/>
+            <wp:effectExtent l="0" t="0" r="0" b="0"/>
+            <wp:docPr id="1341886836" name="Picture 1"/>
+            <wp:cNvGraphicFramePr>
+              <a:graphicFrameLocks xmlns:a="http://schemas.openxmlformats.org/drawingml/2006/main" noChangeAspect="1"/>
+            </wp:cNvGraphicFramePr>
+            <a:graphic xmlns:a="http://schemas.openxmlformats.org/drawingml/2006/main">
+              <a:graphicData uri="http://schemas.openxmlformats.org/drawingml/2006/picture">
+                <pic:pic xmlns:pic="http://schemas.openxmlformats.org/drawingml/2006/picture">
+                  <pic:nvPicPr>
+                    <pic:cNvPr id="1341886836" name=""/>
+                    <pic:cNvPicPr/>
+                  </pic:nvPicPr>
+                  <pic:blipFill>
+                    <a:blip r:embed="rId22"/>
+                    <a:stretch>
+                      <a:fillRect/>
+                    </a:stretch>
+                  </pic:blipFill>
+                  <pic:spPr>
+                    <a:xfrm>
+                      <a:off x="0" y="0"/>
+                      <a:ext cx="3972479" cy="2743583"/>
+                    </a:xfrm>
+                    <a:prstGeom prst="rect">
+                      <a:avLst/>
+                    </a:prstGeom>
+                  </pic:spPr>
+                </pic:pic>
+              </a:graphicData>
+            </a:graphic>
+          </wp:inline>
+        </w:drawing>
+      </w:r>
+    </w:p>
+    <w:p>
+      <w:pPr>
+        <w:pStyle w:val="ListParagraph"/>
+        <w:rPr>
+          <w:sz w:val="28"/>
+          <w:szCs w:val="28"/>
+        </w:rPr>
+      </w:pPr>
     </w:p>
     <w:p>
       <w:pPr>
@@ -1012,6 +1757,97 @@
     </w:p>
     <w:p>
       <w:pPr>
+        <w:pStyle w:val="ListParagraph"/>
+        <w:rPr>
+          <w:sz w:val="28"/>
+          <w:szCs w:val="28"/>
+        </w:rPr>
+      </w:pPr>
+      <w:r>
+        <w:rPr>
+          <w:sz w:val="28"/>
+          <w:szCs w:val="28"/>
+        </w:rPr>
+        <w:drawing>
+          <wp:inline distT="0" distB="0" distL="0" distR="0" wp14:anchorId="66815D22" wp14:editId="1C3AA17C">
+            <wp:extent cx="5943600" cy="2072005"/>
+            <wp:effectExtent l="0" t="0" r="0" b="4445"/>
+            <wp:docPr id="586344769" name="Picture 1"/>
+            <wp:cNvGraphicFramePr>
+              <a:graphicFrameLocks xmlns:a="http://schemas.openxmlformats.org/drawingml/2006/main" noChangeAspect="1"/>
+            </wp:cNvGraphicFramePr>
+            <a:graphic xmlns:a="http://schemas.openxmlformats.org/drawingml/2006/main">
+              <a:graphicData uri="http://schemas.openxmlformats.org/drawingml/2006/picture">
+                <pic:pic xmlns:pic="http://schemas.openxmlformats.org/drawingml/2006/picture">
+                  <pic:nvPicPr>
+                    <pic:cNvPr id="586344769" name=""/>
+                    <pic:cNvPicPr/>
+                  </pic:nvPicPr>
+                  <pic:blipFill>
+                    <a:blip r:embed="rId23"/>
+                    <a:stretch>
+                      <a:fillRect/>
+                    </a:stretch>
+                  </pic:blipFill>
+                  <pic:spPr>
+                    <a:xfrm>
+                      <a:off x="0" y="0"/>
+                      <a:ext cx="5943600" cy="2072005"/>
+                    </a:xfrm>
+                    <a:prstGeom prst="rect">
+                      <a:avLst/>
+                    </a:prstGeom>
+                  </pic:spPr>
+                </pic:pic>
+              </a:graphicData>
+            </a:graphic>
+          </wp:inline>
+        </w:drawing>
+      </w:r>
+    </w:p>
+    <w:p>
+      <w:pPr>
+        <w:pStyle w:val="ListParagraph"/>
+        <w:rPr>
+          <w:sz w:val="28"/>
+          <w:szCs w:val="28"/>
+        </w:rPr>
+      </w:pPr>
+    </w:p>
+    <w:p>
+      <w:pPr>
+        <w:rPr>
+          <w:sz w:val="28"/>
+          <w:szCs w:val="28"/>
+        </w:rPr>
+      </w:pPr>
+    </w:p>
+    <w:p>
+      <w:pPr>
+        <w:rPr>
+          <w:sz w:val="28"/>
+          <w:szCs w:val="28"/>
+        </w:rPr>
+      </w:pPr>
+    </w:p>
+    <w:p>
+      <w:pPr>
+        <w:rPr>
+          <w:sz w:val="28"/>
+          <w:szCs w:val="28"/>
+        </w:rPr>
+      </w:pPr>
+    </w:p>
+    <w:p>
+      <w:pPr>
+        <w:rPr>
+          <w:sz w:val="28"/>
+          <w:szCs w:val="28"/>
+        </w:rPr>
+      </w:pPr>
+    </w:p>
+    <w:p>
+      <w:pPr>
         <w:rPr>
           <w:sz w:val="28"/>
           <w:szCs w:val="28"/>
@@ -1028,6 +1864,11 @@
     </w:p>
     <w:p>
       <w:pPr>
+        <w:pStyle w:val="ListParagraph"/>
+        <w:numPr>
+          <w:ilvl w:val="0"/>
+          <w:numId w:val="6"/>
+        </w:numPr>
         <w:rPr>
           <w:sz w:val="28"/>
           <w:szCs w:val="28"/>
@@ -1043,6 +1884,79 @@
     </w:p>
     <w:p>
       <w:pPr>
+        <w:pStyle w:val="ListParagraph"/>
+        <w:rPr>
+          <w:sz w:val="28"/>
+          <w:szCs w:val="28"/>
+        </w:rPr>
+      </w:pPr>
+    </w:p>
+    <w:p>
+      <w:pPr>
+        <w:pStyle w:val="ListParagraph"/>
+        <w:rPr>
+          <w:sz w:val="28"/>
+          <w:szCs w:val="28"/>
+        </w:rPr>
+      </w:pPr>
+      <w:r>
+        <w:rPr>
+          <w:sz w:val="28"/>
+          <w:szCs w:val="28"/>
+        </w:rPr>
+        <w:drawing>
+          <wp:inline distT="0" distB="0" distL="0" distR="0" wp14:anchorId="6CC06AA0" wp14:editId="766D3BC0">
+            <wp:extent cx="5943600" cy="3419475"/>
+            <wp:effectExtent l="0" t="0" r="0" b="9525"/>
+            <wp:docPr id="1267034918" name="Picture 1"/>
+            <wp:cNvGraphicFramePr>
+              <a:graphicFrameLocks xmlns:a="http://schemas.openxmlformats.org/drawingml/2006/main" noChangeAspect="1"/>
+            </wp:cNvGraphicFramePr>
+            <a:graphic xmlns:a="http://schemas.openxmlformats.org/drawingml/2006/main">
+              <a:graphicData uri="http://schemas.openxmlformats.org/drawingml/2006/picture">
+                <pic:pic xmlns:pic="http://schemas.openxmlformats.org/drawingml/2006/picture">
+                  <pic:nvPicPr>
+                    <pic:cNvPr id="1267034918" name=""/>
+                    <pic:cNvPicPr/>
+                  </pic:nvPicPr>
+                  <pic:blipFill>
+                    <a:blip r:embed="rId24"/>
+                    <a:stretch>
+                      <a:fillRect/>
+                    </a:stretch>
+                  </pic:blipFill>
+                  <pic:spPr>
+                    <a:xfrm>
+                      <a:off x="0" y="0"/>
+                      <a:ext cx="5943600" cy="3419475"/>
+                    </a:xfrm>
+                    <a:prstGeom prst="rect">
+                      <a:avLst/>
+                    </a:prstGeom>
+                  </pic:spPr>
+                </pic:pic>
+              </a:graphicData>
+            </a:graphic>
+          </wp:inline>
+        </w:drawing>
+      </w:r>
+    </w:p>
+    <w:p>
+      <w:pPr>
+        <w:pStyle w:val="ListParagraph"/>
+        <w:rPr>
+          <w:sz w:val="28"/>
+          <w:szCs w:val="28"/>
+        </w:rPr>
+      </w:pPr>
+    </w:p>
+    <w:p>
+      <w:pPr>
+        <w:pStyle w:val="ListParagraph"/>
+        <w:numPr>
+          <w:ilvl w:val="0"/>
+          <w:numId w:val="6"/>
+        </w:numPr>
         <w:rPr>
           <w:sz w:val="28"/>
           <w:szCs w:val="28"/>
@@ -1058,6 +1972,160 @@
     </w:p>
     <w:p>
       <w:pPr>
+        <w:pStyle w:val="ListParagraph"/>
+        <w:rPr>
+          <w:sz w:val="28"/>
+          <w:szCs w:val="28"/>
+        </w:rPr>
+      </w:pPr>
+      <w:r>
+        <w:rPr>
+          <w:sz w:val="28"/>
+          <w:szCs w:val="28"/>
+        </w:rPr>
+        <w:t>Initiate to create a project:</w:t>
+      </w:r>
+    </w:p>
+    <w:p>
+      <w:pPr>
+        <w:pStyle w:val="ListParagraph"/>
+        <w:rPr>
+          <w:sz w:val="28"/>
+          <w:szCs w:val="28"/>
+        </w:rPr>
+      </w:pPr>
+      <w:r>
+        <w:rPr>
+          <w:sz w:val="28"/>
+          <w:szCs w:val="28"/>
+        </w:rPr>
+        <w:drawing>
+          <wp:inline distT="0" distB="0" distL="0" distR="0" wp14:anchorId="7752AB2F" wp14:editId="5F3AAA61">
+            <wp:extent cx="4723074" cy="2764209"/>
+            <wp:effectExtent l="0" t="0" r="1905" b="0"/>
+            <wp:docPr id="279119294" name="Picture 1"/>
+            <wp:cNvGraphicFramePr>
+              <a:graphicFrameLocks xmlns:a="http://schemas.openxmlformats.org/drawingml/2006/main" noChangeAspect="1"/>
+            </wp:cNvGraphicFramePr>
+            <a:graphic xmlns:a="http://schemas.openxmlformats.org/drawingml/2006/main">
+              <a:graphicData uri="http://schemas.openxmlformats.org/drawingml/2006/picture">
+                <pic:pic xmlns:pic="http://schemas.openxmlformats.org/drawingml/2006/picture">
+                  <pic:nvPicPr>
+                    <pic:cNvPr id="279119294" name=""/>
+                    <pic:cNvPicPr/>
+                  </pic:nvPicPr>
+                  <pic:blipFill>
+                    <a:blip r:embed="rId25"/>
+                    <a:stretch>
+                      <a:fillRect/>
+                    </a:stretch>
+                  </pic:blipFill>
+                  <pic:spPr>
+                    <a:xfrm>
+                      <a:off x="0" y="0"/>
+                      <a:ext cx="4729362" cy="2767889"/>
+                    </a:xfrm>
+                    <a:prstGeom prst="rect">
+                      <a:avLst/>
+                    </a:prstGeom>
+                  </pic:spPr>
+                </pic:pic>
+              </a:graphicData>
+            </a:graphic>
+          </wp:inline>
+        </w:drawing>
+      </w:r>
+    </w:p>
+    <w:p>
+      <w:pPr>
+        <w:pStyle w:val="ListParagraph"/>
+        <w:rPr>
+          <w:sz w:val="28"/>
+          <w:szCs w:val="28"/>
+        </w:rPr>
+      </w:pPr>
+      <w:r>
+        <w:rPr>
+          <w:sz w:val="28"/>
+          <w:szCs w:val="28"/>
+        </w:rPr>
+        <w:lastRenderedPageBreak/>
+        <w:t xml:space="preserve">Firebase project Assignment-Module12 </w:t>
+      </w:r>
+      <w:proofErr w:type="gramStart"/>
+      <w:r>
+        <w:rPr>
+          <w:sz w:val="28"/>
+          <w:szCs w:val="28"/>
+        </w:rPr>
+        <w:t>created</w:t>
+      </w:r>
+      <w:proofErr w:type="gramEnd"/>
+      <w:r>
+        <w:rPr>
+          <w:sz w:val="28"/>
+          <w:szCs w:val="28"/>
+        </w:rPr>
+        <w:t xml:space="preserve"> successfully.</w:t>
+      </w:r>
+      <w:r>
+        <w:rPr>
+          <w:sz w:val="28"/>
+          <w:szCs w:val="28"/>
+        </w:rPr>
+        <w:drawing>
+          <wp:inline distT="0" distB="0" distL="0" distR="0" wp14:anchorId="29C77AF8" wp14:editId="5D310088">
+            <wp:extent cx="5943600" cy="2713355"/>
+            <wp:effectExtent l="0" t="0" r="0" b="0"/>
+            <wp:docPr id="80927955" name="Picture 1"/>
+            <wp:cNvGraphicFramePr>
+              <a:graphicFrameLocks xmlns:a="http://schemas.openxmlformats.org/drawingml/2006/main" noChangeAspect="1"/>
+            </wp:cNvGraphicFramePr>
+            <a:graphic xmlns:a="http://schemas.openxmlformats.org/drawingml/2006/main">
+              <a:graphicData uri="http://schemas.openxmlformats.org/drawingml/2006/picture">
+                <pic:pic xmlns:pic="http://schemas.openxmlformats.org/drawingml/2006/picture">
+                  <pic:nvPicPr>
+                    <pic:cNvPr id="80927955" name=""/>
+                    <pic:cNvPicPr/>
+                  </pic:nvPicPr>
+                  <pic:blipFill>
+                    <a:blip r:embed="rId26"/>
+                    <a:stretch>
+                      <a:fillRect/>
+                    </a:stretch>
+                  </pic:blipFill>
+                  <pic:spPr>
+                    <a:xfrm>
+                      <a:off x="0" y="0"/>
+                      <a:ext cx="5943600" cy="2713355"/>
+                    </a:xfrm>
+                    <a:prstGeom prst="rect">
+                      <a:avLst/>
+                    </a:prstGeom>
+                  </pic:spPr>
+                </pic:pic>
+              </a:graphicData>
+            </a:graphic>
+          </wp:inline>
+        </w:drawing>
+      </w:r>
+    </w:p>
+    <w:p>
+      <w:pPr>
+        <w:pStyle w:val="ListParagraph"/>
+        <w:rPr>
+          <w:sz w:val="28"/>
+          <w:szCs w:val="28"/>
+        </w:rPr>
+      </w:pPr>
+    </w:p>
+    <w:p>
+      <w:pPr>
+        <w:pStyle w:val="ListParagraph"/>
+        <w:numPr>
+          <w:ilvl w:val="0"/>
+          <w:numId w:val="6"/>
+        </w:numPr>
         <w:rPr>
           <w:sz w:val="28"/>
           <w:szCs w:val="28"/>
@@ -1105,6 +2173,260 @@
     </w:p>
     <w:p>
       <w:pPr>
+        <w:pStyle w:val="ListParagraph"/>
+        <w:rPr>
+          <w:sz w:val="28"/>
+          <w:szCs w:val="28"/>
+        </w:rPr>
+      </w:pPr>
+      <w:r>
+        <w:rPr>
+          <w:sz w:val="28"/>
+          <w:szCs w:val="28"/>
+        </w:rPr>
+        <w:t>Generating the private key:</w:t>
+      </w:r>
+    </w:p>
+    <w:p>
+      <w:pPr>
+        <w:pStyle w:val="ListParagraph"/>
+        <w:rPr>
+          <w:sz w:val="28"/>
+          <w:szCs w:val="28"/>
+        </w:rPr>
+      </w:pPr>
+      <w:r>
+        <w:rPr>
+          <w:sz w:val="28"/>
+          <w:szCs w:val="28"/>
+        </w:rPr>
+        <w:drawing>
+          <wp:inline distT="0" distB="0" distL="0" distR="0" wp14:anchorId="0FE4D9B8" wp14:editId="0D907B15">
+            <wp:extent cx="4540194" cy="3269328"/>
+            <wp:effectExtent l="0" t="0" r="0" b="7620"/>
+            <wp:docPr id="1030391409" name="Picture 1"/>
+            <wp:cNvGraphicFramePr>
+              <a:graphicFrameLocks xmlns:a="http://schemas.openxmlformats.org/drawingml/2006/main" noChangeAspect="1"/>
+            </wp:cNvGraphicFramePr>
+            <a:graphic xmlns:a="http://schemas.openxmlformats.org/drawingml/2006/main">
+              <a:graphicData uri="http://schemas.openxmlformats.org/drawingml/2006/picture">
+                <pic:pic xmlns:pic="http://schemas.openxmlformats.org/drawingml/2006/picture">
+                  <pic:nvPicPr>
+                    <pic:cNvPr id="1030391409" name=""/>
+                    <pic:cNvPicPr/>
+                  </pic:nvPicPr>
+                  <pic:blipFill>
+                    <a:blip r:embed="rId27"/>
+                    <a:stretch>
+                      <a:fillRect/>
+                    </a:stretch>
+                  </pic:blipFill>
+                  <pic:spPr>
+                    <a:xfrm>
+                      <a:off x="0" y="0"/>
+                      <a:ext cx="4547730" cy="3274755"/>
+                    </a:xfrm>
+                    <a:prstGeom prst="rect">
+                      <a:avLst/>
+                    </a:prstGeom>
+                  </pic:spPr>
+                </pic:pic>
+              </a:graphicData>
+            </a:graphic>
+          </wp:inline>
+        </w:drawing>
+      </w:r>
+    </w:p>
+    <w:p>
+      <w:pPr>
+        <w:pStyle w:val="ListParagraph"/>
+        <w:rPr>
+          <w:sz w:val="28"/>
+          <w:szCs w:val="28"/>
+        </w:rPr>
+      </w:pPr>
+    </w:p>
+    <w:p>
+      <w:pPr>
+        <w:pStyle w:val="ListParagraph"/>
+        <w:rPr>
+          <w:sz w:val="28"/>
+          <w:szCs w:val="28"/>
+        </w:rPr>
+      </w:pPr>
+      <w:r>
+        <w:rPr>
+          <w:sz w:val="28"/>
+          <w:szCs w:val="28"/>
+        </w:rPr>
+        <w:lastRenderedPageBreak/>
+        <w:t>Saving the private key:</w:t>
+      </w:r>
+    </w:p>
+    <w:p>
+      <w:pPr>
+        <w:pStyle w:val="ListParagraph"/>
+        <w:rPr>
+          <w:b/>
+          <w:bCs/>
+          <w:sz w:val="28"/>
+          <w:szCs w:val="28"/>
+        </w:rPr>
+      </w:pPr>
+      <w:r>
+        <w:rPr>
+          <w:b/>
+          <w:bCs/>
+          <w:sz w:val="28"/>
+          <w:szCs w:val="28"/>
+        </w:rPr>
+        <w:drawing>
+          <wp:inline distT="0" distB="0" distL="0" distR="0" wp14:anchorId="79330BE0" wp14:editId="43F807AA">
+            <wp:extent cx="5943600" cy="1562735"/>
+            <wp:effectExtent l="0" t="0" r="0" b="0"/>
+            <wp:docPr id="1296452874" name="Picture 1"/>
+            <wp:cNvGraphicFramePr>
+              <a:graphicFrameLocks xmlns:a="http://schemas.openxmlformats.org/drawingml/2006/main" noChangeAspect="1"/>
+            </wp:cNvGraphicFramePr>
+            <a:graphic xmlns:a="http://schemas.openxmlformats.org/drawingml/2006/main">
+              <a:graphicData uri="http://schemas.openxmlformats.org/drawingml/2006/picture">
+                <pic:pic xmlns:pic="http://schemas.openxmlformats.org/drawingml/2006/picture">
+                  <pic:nvPicPr>
+                    <pic:cNvPr id="1296452874" name=""/>
+                    <pic:cNvPicPr/>
+                  </pic:nvPicPr>
+                  <pic:blipFill>
+                    <a:blip r:embed="rId28"/>
+                    <a:stretch>
+                      <a:fillRect/>
+                    </a:stretch>
+                  </pic:blipFill>
+                  <pic:spPr>
+                    <a:xfrm>
+                      <a:off x="0" y="0"/>
+                      <a:ext cx="5943600" cy="1562735"/>
+                    </a:xfrm>
+                    <a:prstGeom prst="rect">
+                      <a:avLst/>
+                    </a:prstGeom>
+                  </pic:spPr>
+                </pic:pic>
+              </a:graphicData>
+            </a:graphic>
+          </wp:inline>
+        </w:drawing>
+      </w:r>
+    </w:p>
+    <w:p>
+      <w:pPr>
+        <w:pStyle w:val="ListParagraph"/>
+        <w:rPr>
+          <w:b/>
+          <w:bCs/>
+          <w:sz w:val="28"/>
+          <w:szCs w:val="28"/>
+        </w:rPr>
+      </w:pPr>
+    </w:p>
+    <w:p>
+      <w:pPr>
+        <w:pStyle w:val="ListParagraph"/>
+        <w:rPr>
+          <w:sz w:val="28"/>
+          <w:szCs w:val="28"/>
+        </w:rPr>
+      </w:pPr>
+      <w:r>
+        <w:rPr>
+          <w:sz w:val="28"/>
+          <w:szCs w:val="28"/>
+        </w:rPr>
+        <w:t>Firebase service account key copied into the project.</w:t>
+      </w:r>
+    </w:p>
+    <w:p>
+      <w:pPr>
+        <w:pStyle w:val="ListParagraph"/>
+        <w:rPr>
+          <w:b/>
+          <w:bCs/>
+          <w:sz w:val="28"/>
+          <w:szCs w:val="28"/>
+        </w:rPr>
+      </w:pPr>
+      <w:r>
+        <w:rPr>
+          <w:b/>
+          <w:bCs/>
+          <w:sz w:val="28"/>
+          <w:szCs w:val="28"/>
+        </w:rPr>
+        <w:drawing>
+          <wp:inline distT="0" distB="0" distL="0" distR="0" wp14:anchorId="488BBB84" wp14:editId="5071773F">
+            <wp:extent cx="5943600" cy="2976245"/>
+            <wp:effectExtent l="0" t="0" r="0" b="0"/>
+            <wp:docPr id="1945948427" name="Picture 1"/>
+            <wp:cNvGraphicFramePr>
+              <a:graphicFrameLocks xmlns:a="http://schemas.openxmlformats.org/drawingml/2006/main" noChangeAspect="1"/>
+            </wp:cNvGraphicFramePr>
+            <a:graphic xmlns:a="http://schemas.openxmlformats.org/drawingml/2006/main">
+              <a:graphicData uri="http://schemas.openxmlformats.org/drawingml/2006/picture">
+                <pic:pic xmlns:pic="http://schemas.openxmlformats.org/drawingml/2006/picture">
+                  <pic:nvPicPr>
+                    <pic:cNvPr id="1945948427" name=""/>
+                    <pic:cNvPicPr/>
+                  </pic:nvPicPr>
+                  <pic:blipFill>
+                    <a:blip r:embed="rId29"/>
+                    <a:stretch>
+                      <a:fillRect/>
+                    </a:stretch>
+                  </pic:blipFill>
+                  <pic:spPr>
+                    <a:xfrm>
+                      <a:off x="0" y="0"/>
+                      <a:ext cx="5943600" cy="2976245"/>
+                    </a:xfrm>
+                    <a:prstGeom prst="rect">
+                      <a:avLst/>
+                    </a:prstGeom>
+                  </pic:spPr>
+                </pic:pic>
+              </a:graphicData>
+            </a:graphic>
+          </wp:inline>
+        </w:drawing>
+      </w:r>
+    </w:p>
+    <w:p>
+      <w:pPr>
+        <w:pStyle w:val="ListParagraph"/>
+        <w:rPr>
+          <w:b/>
+          <w:bCs/>
+          <w:sz w:val="28"/>
+          <w:szCs w:val="28"/>
+        </w:rPr>
+      </w:pPr>
+    </w:p>
+    <w:p>
+      <w:pPr>
+        <w:pStyle w:val="ListParagraph"/>
+        <w:rPr>
+          <w:b/>
+          <w:bCs/>
+          <w:sz w:val="28"/>
+          <w:szCs w:val="28"/>
+        </w:rPr>
+      </w:pPr>
+    </w:p>
+    <w:p>
+      <w:pPr>
+        <w:pStyle w:val="ListParagraph"/>
+        <w:numPr>
+          <w:ilvl w:val="0"/>
+          <w:numId w:val="6"/>
+        </w:numPr>
         <w:rPr>
           <w:sz w:val="28"/>
           <w:szCs w:val="28"/>
@@ -1120,6 +2442,237 @@
     </w:p>
     <w:p>
       <w:pPr>
+        <w:pStyle w:val="ListParagraph"/>
+        <w:spacing w:after="0" w:line="300" w:lineRule="atLeast"/>
+        <w:rPr>
+          <w:rFonts w:ascii="Segoe UI" w:eastAsia="Times New Roman" w:hAnsi="Segoe UI" w:cs="Segoe UI"/>
+          <w:kern w:val="0"/>
+          <w:sz w:val="21"/>
+          <w:szCs w:val="21"/>
+          <w14:ligatures w14:val="none"/>
+        </w:rPr>
+      </w:pPr>
+    </w:p>
+    <w:p>
+      <w:pPr>
+        <w:pStyle w:val="ListParagraph"/>
+        <w:spacing w:after="0" w:line="300" w:lineRule="atLeast"/>
+        <w:rPr>
+          <w:rFonts w:ascii="Segoe UI" w:eastAsia="Times New Roman" w:hAnsi="Segoe UI" w:cs="Segoe UI"/>
+          <w:kern w:val="0"/>
+          <w:sz w:val="21"/>
+          <w:szCs w:val="21"/>
+          <w14:ligatures w14:val="none"/>
+        </w:rPr>
+      </w:pPr>
+    </w:p>
+    <w:p>
+      <w:pPr>
+        <w:pStyle w:val="ListParagraph"/>
+        <w:spacing w:after="0" w:line="300" w:lineRule="atLeast"/>
+        <w:rPr>
+          <w:rFonts w:ascii="Segoe UI" w:eastAsia="Times New Roman" w:hAnsi="Segoe UI" w:cs="Segoe UI"/>
+          <w:kern w:val="0"/>
+          <w:sz w:val="21"/>
+          <w:szCs w:val="21"/>
+          <w14:ligatures w14:val="none"/>
+        </w:rPr>
+      </w:pPr>
+    </w:p>
+    <w:p>
+      <w:pPr>
+        <w:pStyle w:val="ListParagraph"/>
+        <w:spacing w:after="0" w:line="300" w:lineRule="atLeast"/>
+        <w:rPr>
+          <w:rFonts w:ascii="Segoe UI" w:eastAsia="Times New Roman" w:hAnsi="Segoe UI" w:cs="Segoe UI"/>
+          <w:kern w:val="0"/>
+          <w:sz w:val="21"/>
+          <w:szCs w:val="21"/>
+          <w14:ligatures w14:val="none"/>
+        </w:rPr>
+      </w:pPr>
+    </w:p>
+    <w:p>
+      <w:pPr>
+        <w:pStyle w:val="ListParagraph"/>
+        <w:spacing w:after="0" w:line="300" w:lineRule="atLeast"/>
+        <w:rPr>
+          <w:rFonts w:ascii="Segoe UI" w:eastAsia="Times New Roman" w:hAnsi="Segoe UI" w:cs="Segoe UI"/>
+          <w:kern w:val="0"/>
+          <w:sz w:val="21"/>
+          <w:szCs w:val="21"/>
+          <w14:ligatures w14:val="none"/>
+        </w:rPr>
+      </w:pPr>
+    </w:p>
+    <w:p>
+      <w:pPr>
+        <w:pStyle w:val="ListParagraph"/>
+        <w:spacing w:after="0" w:line="300" w:lineRule="atLeast"/>
+        <w:rPr>
+          <w:rFonts w:ascii="Segoe UI" w:eastAsia="Times New Roman" w:hAnsi="Segoe UI" w:cs="Segoe UI"/>
+          <w:kern w:val="0"/>
+          <w:sz w:val="21"/>
+          <w:szCs w:val="21"/>
+          <w14:ligatures w14:val="none"/>
+        </w:rPr>
+      </w:pPr>
+    </w:p>
+    <w:p>
+      <w:pPr>
+        <w:pStyle w:val="ListParagraph"/>
+        <w:spacing w:after="0" w:line="300" w:lineRule="atLeast"/>
+        <w:rPr>
+          <w:rFonts w:ascii="Segoe UI" w:eastAsia="Times New Roman" w:hAnsi="Segoe UI" w:cs="Segoe UI"/>
+          <w:kern w:val="0"/>
+          <w:sz w:val="21"/>
+          <w:szCs w:val="21"/>
+          <w14:ligatures w14:val="none"/>
+        </w:rPr>
+      </w:pPr>
+    </w:p>
+    <w:p>
+      <w:pPr>
+        <w:pStyle w:val="ListParagraph"/>
+        <w:spacing w:after="0" w:line="300" w:lineRule="atLeast"/>
+        <w:rPr>
+          <w:rFonts w:ascii="Segoe UI" w:eastAsia="Times New Roman" w:hAnsi="Segoe UI" w:cs="Segoe UI"/>
+          <w:kern w:val="0"/>
+          <w:sz w:val="21"/>
+          <w:szCs w:val="21"/>
+          <w14:ligatures w14:val="none"/>
+        </w:rPr>
+      </w:pPr>
+    </w:p>
+    <w:p>
+      <w:pPr>
+        <w:pStyle w:val="ListParagraph"/>
+        <w:spacing w:after="0" w:line="300" w:lineRule="atLeast"/>
+        <w:rPr>
+          <w:rFonts w:ascii="Segoe UI" w:eastAsia="Times New Roman" w:hAnsi="Segoe UI" w:cs="Segoe UI"/>
+          <w:kern w:val="0"/>
+          <w:sz w:val="21"/>
+          <w:szCs w:val="21"/>
+          <w14:ligatures w14:val="none"/>
+        </w:rPr>
+      </w:pPr>
+    </w:p>
+    <w:p>
+      <w:pPr>
+        <w:pStyle w:val="ListParagraph"/>
+        <w:spacing w:after="0" w:line="300" w:lineRule="atLeast"/>
+        <w:rPr>
+          <w:rFonts w:ascii="Segoe UI" w:eastAsia="Times New Roman" w:hAnsi="Segoe UI" w:cs="Segoe UI"/>
+          <w:kern w:val="0"/>
+          <w:sz w:val="21"/>
+          <w:szCs w:val="21"/>
+          <w14:ligatures w14:val="none"/>
+        </w:rPr>
+      </w:pPr>
+    </w:p>
+    <w:p>
+      <w:pPr>
+        <w:pStyle w:val="ListParagraph"/>
+        <w:spacing w:after="0" w:line="300" w:lineRule="atLeast"/>
+        <w:rPr>
+          <w:rFonts w:ascii="Segoe UI" w:eastAsia="Times New Roman" w:hAnsi="Segoe UI" w:cs="Segoe UI"/>
+          <w:kern w:val="0"/>
+          <w:sz w:val="21"/>
+          <w:szCs w:val="21"/>
+          <w14:ligatures w14:val="none"/>
+        </w:rPr>
+      </w:pPr>
+      <w:r>
+        <w:rPr>
+          <w:rFonts w:ascii="Segoe UI" w:eastAsia="Times New Roman" w:hAnsi="Segoe UI" w:cs="Segoe UI"/>
+          <w:kern w:val="0"/>
+          <w:sz w:val="21"/>
+          <w:szCs w:val="21"/>
+          <w14:ligatures w14:val="none"/>
+        </w:rPr>
+        <w:lastRenderedPageBreak/>
+        <w:t>Empty Firebase Realtime Database created.</w:t>
+      </w:r>
+    </w:p>
+    <w:p>
+      <w:pPr>
+        <w:pStyle w:val="ListParagraph"/>
+        <w:spacing w:after="0" w:line="300" w:lineRule="atLeast"/>
+        <w:rPr>
+          <w:rFonts w:ascii="Segoe UI" w:eastAsia="Times New Roman" w:hAnsi="Segoe UI" w:cs="Segoe UI"/>
+          <w:kern w:val="0"/>
+          <w:sz w:val="21"/>
+          <w:szCs w:val="21"/>
+          <w14:ligatures w14:val="none"/>
+        </w:rPr>
+      </w:pPr>
+    </w:p>
+    <w:p>
+      <w:pPr>
+        <w:pStyle w:val="ListParagraph"/>
+        <w:rPr>
+          <w:sz w:val="28"/>
+          <w:szCs w:val="28"/>
+        </w:rPr>
+      </w:pPr>
+      <w:r>
+        <w:rPr>
+          <w:sz w:val="28"/>
+          <w:szCs w:val="28"/>
+        </w:rPr>
+        <w:drawing>
+          <wp:inline distT="0" distB="0" distL="0" distR="0" wp14:anchorId="110CE595" wp14:editId="68F497C7">
+            <wp:extent cx="5291491" cy="2695492"/>
+            <wp:effectExtent l="0" t="0" r="4445" b="0"/>
+            <wp:docPr id="667232144" name="Picture 1"/>
+            <wp:cNvGraphicFramePr>
+              <a:graphicFrameLocks xmlns:a="http://schemas.openxmlformats.org/drawingml/2006/main" noChangeAspect="1"/>
+            </wp:cNvGraphicFramePr>
+            <a:graphic xmlns:a="http://schemas.openxmlformats.org/drawingml/2006/main">
+              <a:graphicData uri="http://schemas.openxmlformats.org/drawingml/2006/picture">
+                <pic:pic xmlns:pic="http://schemas.openxmlformats.org/drawingml/2006/picture">
+                  <pic:nvPicPr>
+                    <pic:cNvPr id="667232144" name=""/>
+                    <pic:cNvPicPr/>
+                  </pic:nvPicPr>
+                  <pic:blipFill>
+                    <a:blip r:embed="rId30"/>
+                    <a:stretch>
+                      <a:fillRect/>
+                    </a:stretch>
+                  </pic:blipFill>
+                  <pic:spPr>
+                    <a:xfrm>
+                      <a:off x="0" y="0"/>
+                      <a:ext cx="5307857" cy="2703829"/>
+                    </a:xfrm>
+                    <a:prstGeom prst="rect">
+                      <a:avLst/>
+                    </a:prstGeom>
+                  </pic:spPr>
+                </pic:pic>
+              </a:graphicData>
+            </a:graphic>
+          </wp:inline>
+        </w:drawing>
+      </w:r>
+    </w:p>
+    <w:p>
+      <w:pPr>
+        <w:pStyle w:val="ListParagraph"/>
+        <w:rPr>
+          <w:sz w:val="28"/>
+          <w:szCs w:val="28"/>
+        </w:rPr>
+      </w:pPr>
+    </w:p>
+    <w:p>
+      <w:pPr>
+        <w:pStyle w:val="ListParagraph"/>
+        <w:numPr>
+          <w:ilvl w:val="0"/>
+          <w:numId w:val="6"/>
+        </w:numPr>
         <w:rPr>
           <w:sz w:val="28"/>
           <w:szCs w:val="28"/>
@@ -1151,6 +2704,70 @@
     </w:p>
     <w:p>
       <w:pPr>
+        <w:pStyle w:val="ListParagraph"/>
+        <w:rPr>
+          <w:sz w:val="28"/>
+          <w:szCs w:val="28"/>
+        </w:rPr>
+      </w:pPr>
+      <w:r>
+        <w:rPr>
+          <w:sz w:val="28"/>
+          <w:szCs w:val="28"/>
+        </w:rPr>
+        <w:drawing>
+          <wp:inline distT="0" distB="0" distL="0" distR="0" wp14:anchorId="1AC1E241" wp14:editId="72DFA394">
+            <wp:extent cx="5943600" cy="2660650"/>
+            <wp:effectExtent l="0" t="0" r="0" b="6350"/>
+            <wp:docPr id="2135083408" name="Picture 1"/>
+            <wp:cNvGraphicFramePr>
+              <a:graphicFrameLocks xmlns:a="http://schemas.openxmlformats.org/drawingml/2006/main" noChangeAspect="1"/>
+            </wp:cNvGraphicFramePr>
+            <a:graphic xmlns:a="http://schemas.openxmlformats.org/drawingml/2006/main">
+              <a:graphicData uri="http://schemas.openxmlformats.org/drawingml/2006/picture">
+                <pic:pic xmlns:pic="http://schemas.openxmlformats.org/drawingml/2006/picture">
+                  <pic:nvPicPr>
+                    <pic:cNvPr id="2135083408" name=""/>
+                    <pic:cNvPicPr/>
+                  </pic:nvPicPr>
+                  <pic:blipFill>
+                    <a:blip r:embed="rId31"/>
+                    <a:stretch>
+                      <a:fillRect/>
+                    </a:stretch>
+                  </pic:blipFill>
+                  <pic:spPr>
+                    <a:xfrm>
+                      <a:off x="0" y="0"/>
+                      <a:ext cx="5943600" cy="2660650"/>
+                    </a:xfrm>
+                    <a:prstGeom prst="rect">
+                      <a:avLst/>
+                    </a:prstGeom>
+                  </pic:spPr>
+                </pic:pic>
+              </a:graphicData>
+            </a:graphic>
+          </wp:inline>
+        </w:drawing>
+      </w:r>
+    </w:p>
+    <w:p>
+      <w:pPr>
+        <w:pStyle w:val="ListParagraph"/>
+        <w:rPr>
+          <w:sz w:val="28"/>
+          <w:szCs w:val="28"/>
+        </w:rPr>
+      </w:pPr>
+    </w:p>
+    <w:p>
+      <w:pPr>
+        <w:pStyle w:val="ListParagraph"/>
+        <w:numPr>
+          <w:ilvl w:val="0"/>
+          <w:numId w:val="6"/>
+        </w:numPr>
         <w:rPr>
           <w:sz w:val="28"/>
           <w:szCs w:val="28"/>
@@ -1166,6 +2783,318 @@
     </w:p>
     <w:p>
       <w:pPr>
+        <w:pStyle w:val="NormalWeb"/>
+        <w:spacing w:line="300" w:lineRule="atLeast"/>
+        <w:ind w:left="360"/>
+        <w:rPr>
+          <w:rFonts w:ascii="Segoe UI" w:hAnsi="Segoe UI" w:cs="Segoe UI"/>
+          <w:sz w:val="21"/>
+          <w:szCs w:val="21"/>
+        </w:rPr>
+      </w:pPr>
+    </w:p>
+    <w:p>
+      <w:pPr>
+        <w:pStyle w:val="NormalWeb"/>
+        <w:spacing w:line="300" w:lineRule="atLeast"/>
+        <w:ind w:left="360"/>
+        <w:rPr>
+          <w:rFonts w:ascii="Segoe UI" w:hAnsi="Segoe UI" w:cs="Segoe UI"/>
+          <w:sz w:val="21"/>
+          <w:szCs w:val="21"/>
+        </w:rPr>
+      </w:pPr>
+    </w:p>
+    <w:p>
+      <w:pPr>
+        <w:pStyle w:val="NormalWeb"/>
+        <w:spacing w:line="300" w:lineRule="atLeast"/>
+        <w:ind w:left="360" w:firstLine="360"/>
+        <w:rPr>
+          <w:rFonts w:ascii="Segoe UI" w:hAnsi="Segoe UI" w:cs="Segoe UI"/>
+          <w:sz w:val="21"/>
+          <w:szCs w:val="21"/>
+        </w:rPr>
+      </w:pPr>
+      <w:r>
+        <w:rPr>
+          <w:rFonts w:ascii="Segoe UI" w:hAnsi="Segoe UI" w:cs="Segoe UI"/>
+          <w:sz w:val="21"/>
+          <w:szCs w:val="21"/>
+        </w:rPr>
+        <w:lastRenderedPageBreak/>
+        <w:t>Two entries were created:</w:t>
+      </w:r>
+    </w:p>
+    <w:p>
+      <w:pPr>
+        <w:pStyle w:val="ListParagraph"/>
+        <w:rPr>
+          <w:sz w:val="28"/>
+          <w:szCs w:val="28"/>
+        </w:rPr>
+      </w:pPr>
+      <w:r>
+        <w:rPr>
+          <w:sz w:val="28"/>
+          <w:szCs w:val="28"/>
+        </w:rPr>
+        <w:drawing>
+          <wp:inline distT="0" distB="0" distL="0" distR="0" wp14:anchorId="423E0B0F" wp14:editId="37049859">
+            <wp:extent cx="5943600" cy="4098925"/>
+            <wp:effectExtent l="0" t="0" r="0" b="0"/>
+            <wp:docPr id="577932194" name="Picture 1"/>
+            <wp:cNvGraphicFramePr>
+              <a:graphicFrameLocks xmlns:a="http://schemas.openxmlformats.org/drawingml/2006/main" noChangeAspect="1"/>
+            </wp:cNvGraphicFramePr>
+            <a:graphic xmlns:a="http://schemas.openxmlformats.org/drawingml/2006/main">
+              <a:graphicData uri="http://schemas.openxmlformats.org/drawingml/2006/picture">
+                <pic:pic xmlns:pic="http://schemas.openxmlformats.org/drawingml/2006/picture">
+                  <pic:nvPicPr>
+                    <pic:cNvPr id="577932194" name=""/>
+                    <pic:cNvPicPr/>
+                  </pic:nvPicPr>
+                  <pic:blipFill>
+                    <a:blip r:embed="rId32"/>
+                    <a:stretch>
+                      <a:fillRect/>
+                    </a:stretch>
+                  </pic:blipFill>
+                  <pic:spPr>
+                    <a:xfrm>
+                      <a:off x="0" y="0"/>
+                      <a:ext cx="5943600" cy="4098925"/>
+                    </a:xfrm>
+                    <a:prstGeom prst="rect">
+                      <a:avLst/>
+                    </a:prstGeom>
+                  </pic:spPr>
+                </pic:pic>
+              </a:graphicData>
+            </a:graphic>
+          </wp:inline>
+        </w:drawing>
+      </w:r>
+    </w:p>
+    <w:p>
+      <w:pPr>
+        <w:pStyle w:val="ListParagraph"/>
+        <w:rPr>
+          <w:sz w:val="28"/>
+          <w:szCs w:val="28"/>
+        </w:rPr>
+      </w:pPr>
+    </w:p>
+    <w:p>
+      <w:pPr>
+        <w:pStyle w:val="ListParagraph"/>
+        <w:rPr>
+          <w:sz w:val="28"/>
+          <w:szCs w:val="28"/>
+        </w:rPr>
+      </w:pPr>
+      <w:r>
+        <w:rPr>
+          <w:sz w:val="28"/>
+          <w:szCs w:val="28"/>
+        </w:rPr>
+        <w:t>The second entry was updated with an additional field:</w:t>
+      </w:r>
+    </w:p>
+    <w:p>
+      <w:pPr>
+        <w:pStyle w:val="ListParagraph"/>
+        <w:rPr>
+          <w:sz w:val="28"/>
+          <w:szCs w:val="28"/>
+        </w:rPr>
+      </w:pPr>
+      <w:r>
+        <w:rPr>
+          <w:sz w:val="28"/>
+          <w:szCs w:val="28"/>
+        </w:rPr>
+        <w:drawing>
+          <wp:inline distT="0" distB="0" distL="0" distR="0" wp14:anchorId="4081F13A" wp14:editId="028299EA">
+            <wp:extent cx="5943600" cy="1758315"/>
+            <wp:effectExtent l="0" t="0" r="0" b="0"/>
+            <wp:docPr id="2083976687" name="Picture 1"/>
+            <wp:cNvGraphicFramePr>
+              <a:graphicFrameLocks xmlns:a="http://schemas.openxmlformats.org/drawingml/2006/main" noChangeAspect="1"/>
+            </wp:cNvGraphicFramePr>
+            <a:graphic xmlns:a="http://schemas.openxmlformats.org/drawingml/2006/main">
+              <a:graphicData uri="http://schemas.openxmlformats.org/drawingml/2006/picture">
+                <pic:pic xmlns:pic="http://schemas.openxmlformats.org/drawingml/2006/picture">
+                  <pic:nvPicPr>
+                    <pic:cNvPr id="2083976687" name=""/>
+                    <pic:cNvPicPr/>
+                  </pic:nvPicPr>
+                  <pic:blipFill>
+                    <a:blip r:embed="rId33"/>
+                    <a:stretch>
+                      <a:fillRect/>
+                    </a:stretch>
+                  </pic:blipFill>
+                  <pic:spPr>
+                    <a:xfrm>
+                      <a:off x="0" y="0"/>
+                      <a:ext cx="5943600" cy="1758315"/>
+                    </a:xfrm>
+                    <a:prstGeom prst="rect">
+                      <a:avLst/>
+                    </a:prstGeom>
+                  </pic:spPr>
+                </pic:pic>
+              </a:graphicData>
+            </a:graphic>
+          </wp:inline>
+        </w:drawing>
+      </w:r>
+    </w:p>
+    <w:p>
+      <w:pPr>
+        <w:pStyle w:val="ListParagraph"/>
+        <w:rPr>
+          <w:sz w:val="28"/>
+          <w:szCs w:val="28"/>
+        </w:rPr>
+      </w:pPr>
+    </w:p>
+    <w:p>
+      <w:pPr>
+        <w:pStyle w:val="ListParagraph"/>
+        <w:rPr>
+          <w:sz w:val="28"/>
+          <w:szCs w:val="28"/>
+        </w:rPr>
+      </w:pPr>
+    </w:p>
+    <w:p>
+      <w:pPr>
+        <w:pStyle w:val="ListParagraph"/>
+        <w:rPr>
+          <w:sz w:val="28"/>
+          <w:szCs w:val="28"/>
+        </w:rPr>
+      </w:pPr>
+    </w:p>
+    <w:p>
+      <w:pPr>
+        <w:pStyle w:val="ListParagraph"/>
+        <w:rPr>
+          <w:sz w:val="28"/>
+          <w:szCs w:val="28"/>
+        </w:rPr>
+      </w:pPr>
+    </w:p>
+    <w:p>
+      <w:pPr>
+        <w:pStyle w:val="ListParagraph"/>
+        <w:rPr>
+          <w:sz w:val="28"/>
+          <w:szCs w:val="28"/>
+        </w:rPr>
+      </w:pPr>
+    </w:p>
+    <w:p>
+      <w:pPr>
+        <w:pStyle w:val="ListParagraph"/>
+        <w:rPr>
+          <w:sz w:val="28"/>
+          <w:szCs w:val="28"/>
+        </w:rPr>
+      </w:pPr>
+    </w:p>
+    <w:p>
+      <w:pPr>
+        <w:pStyle w:val="ListParagraph"/>
+        <w:rPr>
+          <w:sz w:val="28"/>
+          <w:szCs w:val="28"/>
+        </w:rPr>
+      </w:pPr>
+      <w:r>
+        <w:rPr>
+          <w:sz w:val="28"/>
+          <w:szCs w:val="28"/>
+        </w:rPr>
+        <w:lastRenderedPageBreak/>
+        <w:t>Resulting Data Structure</w:t>
+      </w:r>
+      <w:r>
+        <w:rPr>
+          <w:sz w:val="28"/>
+          <w:szCs w:val="28"/>
+        </w:rPr>
+        <w:t>:</w:t>
+      </w:r>
+    </w:p>
+    <w:p>
+      <w:pPr>
+        <w:pStyle w:val="ListParagraph"/>
+        <w:rPr>
+          <w:sz w:val="28"/>
+          <w:szCs w:val="28"/>
+        </w:rPr>
+      </w:pPr>
+      <w:r>
+        <w:rPr>
+          <w:sz w:val="28"/>
+          <w:szCs w:val="28"/>
+        </w:rPr>
+        <w:drawing>
+          <wp:inline distT="0" distB="0" distL="0" distR="0" wp14:anchorId="048C4DD9" wp14:editId="15933C40">
+            <wp:extent cx="3019846" cy="1952898"/>
+            <wp:effectExtent l="0" t="0" r="0" b="9525"/>
+            <wp:docPr id="2036319646" name="Picture 1"/>
+            <wp:cNvGraphicFramePr>
+              <a:graphicFrameLocks xmlns:a="http://schemas.openxmlformats.org/drawingml/2006/main" noChangeAspect="1"/>
+            </wp:cNvGraphicFramePr>
+            <a:graphic xmlns:a="http://schemas.openxmlformats.org/drawingml/2006/main">
+              <a:graphicData uri="http://schemas.openxmlformats.org/drawingml/2006/picture">
+                <pic:pic xmlns:pic="http://schemas.openxmlformats.org/drawingml/2006/picture">
+                  <pic:nvPicPr>
+                    <pic:cNvPr id="2036319646" name=""/>
+                    <pic:cNvPicPr/>
+                  </pic:nvPicPr>
+                  <pic:blipFill>
+                    <a:blip r:embed="rId34"/>
+                    <a:stretch>
+                      <a:fillRect/>
+                    </a:stretch>
+                  </pic:blipFill>
+                  <pic:spPr>
+                    <a:xfrm>
+                      <a:off x="0" y="0"/>
+                      <a:ext cx="3019846" cy="1952898"/>
+                    </a:xfrm>
+                    <a:prstGeom prst="rect">
+                      <a:avLst/>
+                    </a:prstGeom>
+                  </pic:spPr>
+                </pic:pic>
+              </a:graphicData>
+            </a:graphic>
+          </wp:inline>
+        </w:drawing>
+      </w:r>
+    </w:p>
+    <w:p>
+      <w:pPr>
+        <w:pStyle w:val="ListParagraph"/>
+        <w:rPr>
+          <w:sz w:val="28"/>
+          <w:szCs w:val="28"/>
+        </w:rPr>
+      </w:pPr>
+    </w:p>
+    <w:p>
+      <w:pPr>
+        <w:pStyle w:val="ListParagraph"/>
+        <w:numPr>
+          <w:ilvl w:val="0"/>
+          <w:numId w:val="6"/>
+        </w:numPr>
         <w:rPr>
           <w:sz w:val="28"/>
           <w:szCs w:val="28"/>
@@ -1197,6 +3126,79 @@
     </w:p>
     <w:p>
       <w:pPr>
+        <w:pStyle w:val="ListParagraph"/>
+        <w:rPr>
+          <w:sz w:val="28"/>
+          <w:szCs w:val="28"/>
+        </w:rPr>
+      </w:pPr>
+    </w:p>
+    <w:p>
+      <w:pPr>
+        <w:pStyle w:val="ListParagraph"/>
+        <w:rPr>
+          <w:sz w:val="28"/>
+          <w:szCs w:val="28"/>
+        </w:rPr>
+      </w:pPr>
+      <w:r>
+        <w:rPr>
+          <w:sz w:val="28"/>
+          <w:szCs w:val="28"/>
+        </w:rPr>
+        <w:drawing>
+          <wp:inline distT="0" distB="0" distL="0" distR="0" wp14:anchorId="37B01FD8" wp14:editId="119BEEC9">
+            <wp:extent cx="5943600" cy="4033520"/>
+            <wp:effectExtent l="0" t="0" r="0" b="5080"/>
+            <wp:docPr id="1298207591" name="Picture 1"/>
+            <wp:cNvGraphicFramePr>
+              <a:graphicFrameLocks xmlns:a="http://schemas.openxmlformats.org/drawingml/2006/main" noChangeAspect="1"/>
+            </wp:cNvGraphicFramePr>
+            <a:graphic xmlns:a="http://schemas.openxmlformats.org/drawingml/2006/main">
+              <a:graphicData uri="http://schemas.openxmlformats.org/drawingml/2006/picture">
+                <pic:pic xmlns:pic="http://schemas.openxmlformats.org/drawingml/2006/picture">
+                  <pic:nvPicPr>
+                    <pic:cNvPr id="1298207591" name=""/>
+                    <pic:cNvPicPr/>
+                  </pic:nvPicPr>
+                  <pic:blipFill>
+                    <a:blip r:embed="rId35"/>
+                    <a:stretch>
+                      <a:fillRect/>
+                    </a:stretch>
+                  </pic:blipFill>
+                  <pic:spPr>
+                    <a:xfrm>
+                      <a:off x="0" y="0"/>
+                      <a:ext cx="5943600" cy="4033520"/>
+                    </a:xfrm>
+                    <a:prstGeom prst="rect">
+                      <a:avLst/>
+                    </a:prstGeom>
+                  </pic:spPr>
+                </pic:pic>
+              </a:graphicData>
+            </a:graphic>
+          </wp:inline>
+        </w:drawing>
+      </w:r>
+    </w:p>
+    <w:p>
+      <w:pPr>
+        <w:pStyle w:val="ListParagraph"/>
+        <w:rPr>
+          <w:sz w:val="28"/>
+          <w:szCs w:val="28"/>
+        </w:rPr>
+      </w:pPr>
+    </w:p>
+    <w:p>
+      <w:pPr>
+        <w:pStyle w:val="ListParagraph"/>
+        <w:numPr>
+          <w:ilvl w:val="0"/>
+          <w:numId w:val="6"/>
+        </w:numPr>
         <w:rPr>
           <w:sz w:val="28"/>
           <w:szCs w:val="28"/>
@@ -1208,6 +3210,57 @@
           <w:szCs w:val="28"/>
         </w:rPr>
         <w:t>Provide a screenshot from Firebase to show that your database has been written as expected.</w:t>
+      </w:r>
+    </w:p>
+    <w:p>
+      <w:pPr>
+        <w:pStyle w:val="ListParagraph"/>
+        <w:rPr>
+          <w:sz w:val="28"/>
+          <w:szCs w:val="28"/>
+        </w:rPr>
+      </w:pPr>
+      <w:r>
+        <w:rPr>
+          <w:sz w:val="28"/>
+          <w:szCs w:val="28"/>
+        </w:rPr>
+        <w:lastRenderedPageBreak/>
+        <w:drawing>
+          <wp:inline distT="0" distB="0" distL="0" distR="0" wp14:anchorId="65E9FE13" wp14:editId="3A46B8A2">
+            <wp:extent cx="5943600" cy="3617595"/>
+            <wp:effectExtent l="0" t="0" r="0" b="1905"/>
+            <wp:docPr id="870631218" name="Picture 1"/>
+            <wp:cNvGraphicFramePr>
+              <a:graphicFrameLocks xmlns:a="http://schemas.openxmlformats.org/drawingml/2006/main" noChangeAspect="1"/>
+            </wp:cNvGraphicFramePr>
+            <a:graphic xmlns:a="http://schemas.openxmlformats.org/drawingml/2006/main">
+              <a:graphicData uri="http://schemas.openxmlformats.org/drawingml/2006/picture">
+                <pic:pic xmlns:pic="http://schemas.openxmlformats.org/drawingml/2006/picture">
+                  <pic:nvPicPr>
+                    <pic:cNvPr id="870631218" name=""/>
+                    <pic:cNvPicPr/>
+                  </pic:nvPicPr>
+                  <pic:blipFill>
+                    <a:blip r:embed="rId36"/>
+                    <a:stretch>
+                      <a:fillRect/>
+                    </a:stretch>
+                  </pic:blipFill>
+                  <pic:spPr>
+                    <a:xfrm>
+                      <a:off x="0" y="0"/>
+                      <a:ext cx="5943600" cy="3617595"/>
+                    </a:xfrm>
+                    <a:prstGeom prst="rect">
+                      <a:avLst/>
+                    </a:prstGeom>
+                  </pic:spPr>
+                </pic:pic>
+              </a:graphicData>
+            </a:graphic>
+          </wp:inline>
+        </w:drawing>
       </w:r>
     </w:p>
     <w:p>
@@ -1516,6 +3569,92 @@
     </w:lvl>
   </w:abstractNum>
   <w:abstractNum w:abstractNumId="3" w15:restartNumberingAfterBreak="0">
+    <w:nsid w:val="25637565"/>
+    <w:multiLevelType w:val="hybridMultilevel"/>
+    <w:tmpl w:val="D214D946"/>
+    <w:lvl w:ilvl="0" w:tplc="04090019">
+      <w:start w:val="1"/>
+      <w:numFmt w:val="lowerLetter"/>
+      <w:lvlText w:val="%1."/>
+      <w:lvlJc w:val="left"/>
+      <w:pPr>
+        <w:ind w:left="720" w:hanging="360"/>
+      </w:pPr>
+    </w:lvl>
+    <w:lvl w:ilvl="1" w:tplc="04090019" w:tentative="1">
+      <w:start w:val="1"/>
+      <w:numFmt w:val="lowerLetter"/>
+      <w:lvlText w:val="%2."/>
+      <w:lvlJc w:val="left"/>
+      <w:pPr>
+        <w:ind w:left="1440" w:hanging="360"/>
+      </w:pPr>
+    </w:lvl>
+    <w:lvl w:ilvl="2" w:tplc="0409001B" w:tentative="1">
+      <w:start w:val="1"/>
+      <w:numFmt w:val="lowerRoman"/>
+      <w:lvlText w:val="%3."/>
+      <w:lvlJc w:val="right"/>
+      <w:pPr>
+        <w:ind w:left="2160" w:hanging="180"/>
+      </w:pPr>
+    </w:lvl>
+    <w:lvl w:ilvl="3" w:tplc="0409000F" w:tentative="1">
+      <w:start w:val="1"/>
+      <w:numFmt w:val="decimal"/>
+      <w:lvlText w:val="%4."/>
+      <w:lvlJc w:val="left"/>
+      <w:pPr>
+        <w:ind w:left="2880" w:hanging="360"/>
+      </w:pPr>
+    </w:lvl>
+    <w:lvl w:ilvl="4" w:tplc="04090019" w:tentative="1">
+      <w:start w:val="1"/>
+      <w:numFmt w:val="lowerLetter"/>
+      <w:lvlText w:val="%5."/>
+      <w:lvlJc w:val="left"/>
+      <w:pPr>
+        <w:ind w:left="3600" w:hanging="360"/>
+      </w:pPr>
+    </w:lvl>
+    <w:lvl w:ilvl="5" w:tplc="0409001B" w:tentative="1">
+      <w:start w:val="1"/>
+      <w:numFmt w:val="lowerRoman"/>
+      <w:lvlText w:val="%6."/>
+      <w:lvlJc w:val="right"/>
+      <w:pPr>
+        <w:ind w:left="4320" w:hanging="180"/>
+      </w:pPr>
+    </w:lvl>
+    <w:lvl w:ilvl="6" w:tplc="0409000F" w:tentative="1">
+      <w:start w:val="1"/>
+      <w:numFmt w:val="decimal"/>
+      <w:lvlText w:val="%7."/>
+      <w:lvlJc w:val="left"/>
+      <w:pPr>
+        <w:ind w:left="5040" w:hanging="360"/>
+      </w:pPr>
+    </w:lvl>
+    <w:lvl w:ilvl="7" w:tplc="04090019" w:tentative="1">
+      <w:start w:val="1"/>
+      <w:numFmt w:val="lowerLetter"/>
+      <w:lvlText w:val="%8."/>
+      <w:lvlJc w:val="left"/>
+      <w:pPr>
+        <w:ind w:left="5760" w:hanging="360"/>
+      </w:pPr>
+    </w:lvl>
+    <w:lvl w:ilvl="8" w:tplc="0409001B" w:tentative="1">
+      <w:start w:val="1"/>
+      <w:numFmt w:val="lowerRoman"/>
+      <w:lvlText w:val="%9."/>
+      <w:lvlJc w:val="right"/>
+      <w:pPr>
+        <w:ind w:left="6480" w:hanging="180"/>
+      </w:pPr>
+    </w:lvl>
+  </w:abstractNum>
+  <w:abstractNum w:abstractNumId="4" w15:restartNumberingAfterBreak="0">
     <w:nsid w:val="26AA1056"/>
     <w:multiLevelType w:val="hybridMultilevel"/>
     <w:tmpl w:val="C5E6A444"/>
@@ -1604,7 +3743,7 @@
       </w:pPr>
     </w:lvl>
   </w:abstractNum>
-  <w:abstractNum w:abstractNumId="4" w15:restartNumberingAfterBreak="0">
+  <w:abstractNum w:abstractNumId="5" w15:restartNumberingAfterBreak="0">
     <w:nsid w:val="5C8E0AEA"/>
     <w:multiLevelType w:val="hybridMultilevel"/>
     <w:tmpl w:val="EB20D3EE"/>
@@ -1728,16 +3867,19 @@
     </w:lvlOverride>
   </w:num>
   <w:num w:numId="2" w16cid:durableId="205916559">
-    <w:abstractNumId w:val="3"/>
+    <w:abstractNumId w:val="4"/>
   </w:num>
   <w:num w:numId="3" w16cid:durableId="1506281375">
     <w:abstractNumId w:val="2"/>
   </w:num>
   <w:num w:numId="4" w16cid:durableId="1088967370">
-    <w:abstractNumId w:val="4"/>
+    <w:abstractNumId w:val="5"/>
   </w:num>
   <w:num w:numId="5" w16cid:durableId="959146198">
     <w:abstractNumId w:val="1"/>
+  </w:num>
+  <w:num w:numId="6" w16cid:durableId="932123986">
+    <w:abstractNumId w:val="3"/>
   </w:num>
 </w:numbering>
 </file>
@@ -2671,6 +4813,24 @@
       <w:iCs/>
     </w:rPr>
   </w:style>
+  <w:style w:type="paragraph" w:styleId="NormalWeb">
+    <w:name w:val="Normal (Web)"/>
+    <w:basedOn w:val="Normal"/>
+    <w:uiPriority w:val="99"/>
+    <w:semiHidden/>
+    <w:unhideWhenUsed/>
+    <w:rsid w:val="002E583C"/>
+    <w:pPr>
+      <w:spacing w:before="100" w:beforeAutospacing="1" w:after="100" w:afterAutospacing="1" w:line="240" w:lineRule="auto"/>
+    </w:pPr>
+    <w:rPr>
+      <w:rFonts w:ascii="Times New Roman" w:eastAsia="Times New Roman" w:hAnsi="Times New Roman" w:cs="Times New Roman"/>
+      <w:kern w:val="0"/>
+      <w:sz w:val="24"/>
+      <w:szCs w:val="24"/>
+      <w14:ligatures w14:val="none"/>
+    </w:rPr>
+  </w:style>
 </w:styles>
 </file>
 

</xml_diff>